<commit_message>
refactor(ui): modularize Tkinter app and add configurable thresholds
Split the monolithic Application class into dedicated UI modules
(scoring/Adopt-vs-Adapt screens, analyzer rules panel, AI discussion
panel, threshold editor, shared scrollable-window helper) and extract
the mermaid rendering from html_writer to its own module. Add a
configurable score-thresholds editor (Configuration > Seuils) persisted
in app_settings.json and consumed by CustomizationMetrics for both
scoring and Adopt-vs-Adapt levels. Threshold screen now ships with a
vertical scrollbar and a fixed footer for save/reset/close actions,
mirroring the scoring screens.

Made-with: Cursor
</commit_message>
<xml_diff>
--- a/process/guide_utilisation_fr.docx
+++ b/process/guide_utilisation_fr.docx
@@ -335,18 +335,16 @@
         </w:rPr>
         <w:t xml:space="preserve">, profils, permission sets, inventaire, violations PMD) et deux documents Word (un dictionnaire de données et un résumé contenant des conseils </w:t>
       </w:r>
-      <w:proofErr w:type="spellStart"/>
-      <w:r>
-        <w:rPr>
-          <w:rFonts w:ascii="Calibri" w:hAnsi="Calibri" w:cs="Calibri"/>
-          <w:color w:val="000000"/>
-          <w:kern w:val="0"/>
-          <w:sz w:val="22"/>
-          <w:szCs w:val="22"/>
-        </w:rPr>
-        <w:t>priôrisés</w:t>
-      </w:r>
-      <w:proofErr w:type="spellEnd"/>
+      <w:r>
+        <w:rPr>
+          <w:rFonts w:ascii="Calibri" w:hAnsi="Calibri" w:cs="Calibri"/>
+          <w:color w:val="000000"/>
+          <w:kern w:val="0"/>
+          <w:sz w:val="22"/>
+          <w:szCs w:val="22"/>
+        </w:rPr>
+        <w:t>priorisés</w:t>
+      </w:r>
       <w:r>
         <w:rPr>
           <w:rFonts w:ascii="Calibri" w:hAnsi="Calibri" w:cs="Calibri"/>
@@ -583,18 +581,16 @@
         </w:rPr>
         <w:t xml:space="preserve"> : pour disposer d'un support standardisé permettant d'arbitrer et de </w:t>
       </w:r>
-      <w:proofErr w:type="spellStart"/>
-      <w:r>
-        <w:rPr>
-          <w:rFonts w:ascii="Calibri" w:hAnsi="Calibri" w:cs="Calibri"/>
-          <w:color w:val="000000"/>
-          <w:kern w:val="0"/>
-          <w:sz w:val="22"/>
-          <w:szCs w:val="22"/>
-        </w:rPr>
-        <w:t>priôriser</w:t>
-      </w:r>
-      <w:proofErr w:type="spellEnd"/>
+      <w:r>
+        <w:rPr>
+          <w:rFonts w:ascii="Calibri" w:hAnsi="Calibri" w:cs="Calibri"/>
+          <w:color w:val="000000"/>
+          <w:kern w:val="0"/>
+          <w:sz w:val="22"/>
+          <w:szCs w:val="22"/>
+        </w:rPr>
+        <w:t>prioriser</w:t>
+      </w:r>
       <w:r>
         <w:rPr>
           <w:rFonts w:ascii="Calibri" w:hAnsi="Calibri" w:cs="Calibri"/>
@@ -758,18 +754,16 @@
         <w:tab/>
         <w:t xml:space="preserve">Conseils </w:t>
       </w:r>
-      <w:proofErr w:type="spellStart"/>
-      <w:r>
-        <w:rPr>
-          <w:rFonts w:ascii="Calibri" w:hAnsi="Calibri" w:cs="Calibri"/>
-          <w:color w:val="000000"/>
-          <w:kern w:val="0"/>
-          <w:sz w:val="22"/>
-          <w:szCs w:val="22"/>
-        </w:rPr>
-        <w:t>priôrisés</w:t>
-      </w:r>
-      <w:proofErr w:type="spellEnd"/>
+      <w:r>
+        <w:rPr>
+          <w:rFonts w:ascii="Calibri" w:hAnsi="Calibri" w:cs="Calibri"/>
+          <w:color w:val="000000"/>
+          <w:kern w:val="0"/>
+          <w:sz w:val="22"/>
+          <w:szCs w:val="22"/>
+        </w:rPr>
+        <w:t>priorisés</w:t>
+      </w:r>
       <w:r>
         <w:rPr>
           <w:rFonts w:ascii="Calibri" w:hAnsi="Calibri" w:cs="Calibri"/>
@@ -4836,7 +4830,15 @@
           <w:kern w:val="0"/>
         </w:rPr>
       </w:pPr>
-      <w:r>
+    </w:p>
+    <w:p>
+      <w:pPr>
+        <w:widowControl w:val="0"/>
+        <w:autoSpaceDE w:val="0"/>
+        <w:autoSpaceDN w:val="0"/>
+        <w:adjustRightInd w:val="0"/>
+        <w:spacing w:before="160" w:line="240" w:lineRule="auto"/>
+        <w:ind w:left="360" w:right="360"/>
         <w:rPr>
           <w:rFonts w:ascii="Calibri" w:hAnsi="Calibri" w:cs="Calibri"/>
           <w:b/>
@@ -4844,10 +4846,62 @@
           <w:color w:val="C85028"/>
           <w:kern w:val="0"/>
         </w:rPr>
-        <w:t xml:space="preserve">[PLACEHOLDER DIAGRAMME 2 : Workflow Design </w:t>
-      </w:r>
-      <w:proofErr w:type="spellStart"/>
-      <w:r>
+      </w:pPr>
+      <w:r>
+        <w:rPr>
+          <w:rFonts w:ascii="Calibri" w:hAnsi="Calibri" w:cs="Calibri"/>
+          <w:b/>
+          <w:bCs/>
+          <w:noProof/>
+          <w:color w:val="C85028"/>
+          <w:kern w:val="0"/>
+        </w:rPr>
+        <w:lastRenderedPageBreak/>
+        <w:drawing>
+          <wp:inline distT="0" distB="0" distL="0" distR="0" wp14:anchorId="23F0AD20" wp14:editId="4AFF1385">
+            <wp:extent cx="6120130" cy="3944620"/>
+            <wp:effectExtent l="0" t="0" r="0" b="0"/>
+            <wp:docPr id="1258887113" name="Picture 1"/>
+            <wp:cNvGraphicFramePr>
+              <a:graphicFrameLocks xmlns:a="http://schemas.openxmlformats.org/drawingml/2006/main" noChangeAspect="1"/>
+            </wp:cNvGraphicFramePr>
+            <a:graphic xmlns:a="http://schemas.openxmlformats.org/drawingml/2006/main">
+              <a:graphicData uri="http://schemas.openxmlformats.org/drawingml/2006/picture">
+                <pic:pic xmlns:pic="http://schemas.openxmlformats.org/drawingml/2006/picture">
+                  <pic:nvPicPr>
+                    <pic:cNvPr id="1258887113" name=""/>
+                    <pic:cNvPicPr/>
+                  </pic:nvPicPr>
+                  <pic:blipFill>
+                    <a:blip r:embed="rId4"/>
+                    <a:stretch>
+                      <a:fillRect/>
+                    </a:stretch>
+                  </pic:blipFill>
+                  <pic:spPr>
+                    <a:xfrm>
+                      <a:off x="0" y="0"/>
+                      <a:ext cx="6120130" cy="3944620"/>
+                    </a:xfrm>
+                    <a:prstGeom prst="rect">
+                      <a:avLst/>
+                    </a:prstGeom>
+                  </pic:spPr>
+                </pic:pic>
+              </a:graphicData>
+            </a:graphic>
+          </wp:inline>
+        </w:drawing>
+      </w:r>
+    </w:p>
+    <w:p>
+      <w:pPr>
+        <w:widowControl w:val="0"/>
+        <w:autoSpaceDE w:val="0"/>
+        <w:autoSpaceDN w:val="0"/>
+        <w:adjustRightInd w:val="0"/>
+        <w:spacing w:before="160" w:line="240" w:lineRule="auto"/>
+        <w:ind w:left="360" w:right="360"/>
         <w:rPr>
           <w:rFonts w:ascii="Calibri" w:hAnsi="Calibri" w:cs="Calibri"/>
           <w:b/>
@@ -4855,10 +4909,16 @@
           <w:color w:val="C85028"/>
           <w:kern w:val="0"/>
         </w:rPr>
-        <w:t>Review</w:t>
-      </w:r>
-      <w:proofErr w:type="spellEnd"/>
-      <w:r>
+      </w:pPr>
+    </w:p>
+    <w:p>
+      <w:pPr>
+        <w:widowControl w:val="0"/>
+        <w:autoSpaceDE w:val="0"/>
+        <w:autoSpaceDN w:val="0"/>
+        <w:adjustRightInd w:val="0"/>
+        <w:spacing w:before="160" w:line="240" w:lineRule="auto"/>
+        <w:ind w:left="360" w:right="360"/>
         <w:rPr>
           <w:rFonts w:ascii="Calibri" w:hAnsi="Calibri" w:cs="Calibri"/>
           <w:b/>
@@ -4866,10 +4926,16 @@
           <w:color w:val="C85028"/>
           <w:kern w:val="0"/>
         </w:rPr>
-        <w:t xml:space="preserve"> - insérer ici l'export PNG ou PDF du fichier </w:t>
-      </w:r>
-      <w:proofErr w:type="spellStart"/>
-      <w:r>
+      </w:pPr>
+    </w:p>
+    <w:p>
+      <w:pPr>
+        <w:widowControl w:val="0"/>
+        <w:autoSpaceDE w:val="0"/>
+        <w:autoSpaceDN w:val="0"/>
+        <w:adjustRightInd w:val="0"/>
+        <w:spacing w:before="160" w:line="240" w:lineRule="auto"/>
+        <w:ind w:left="360" w:right="360"/>
         <w:rPr>
           <w:rFonts w:ascii="Calibri" w:hAnsi="Calibri" w:cs="Calibri"/>
           <w:b/>
@@ -4877,10 +4943,16 @@
           <w:color w:val="C85028"/>
           <w:kern w:val="0"/>
         </w:rPr>
-        <w:t>design_review_</w:t>
-      </w:r>
-      <w:proofErr w:type="gramStart"/>
-      <w:r>
+      </w:pPr>
+    </w:p>
+    <w:p>
+      <w:pPr>
+        <w:widowControl w:val="0"/>
+        <w:autoSpaceDE w:val="0"/>
+        <w:autoSpaceDN w:val="0"/>
+        <w:adjustRightInd w:val="0"/>
+        <w:spacing w:before="160" w:line="240" w:lineRule="auto"/>
+        <w:ind w:left="360" w:right="360"/>
         <w:rPr>
           <w:rFonts w:ascii="Calibri" w:hAnsi="Calibri" w:cs="Calibri"/>
           <w:b/>
@@ -4888,36 +4960,6 @@
           <w:color w:val="C85028"/>
           <w:kern w:val="0"/>
         </w:rPr>
-        <w:t>workflow.drawio</w:t>
-      </w:r>
-      <w:proofErr w:type="spellEnd"/>
-      <w:proofErr w:type="gramEnd"/>
-      <w:r>
-        <w:rPr>
-          <w:rFonts w:ascii="Calibri" w:hAnsi="Calibri" w:cs="Calibri"/>
-          <w:b/>
-          <w:bCs/>
-          <w:color w:val="C85028"/>
-          <w:kern w:val="0"/>
-        </w:rPr>
-        <w:t>.]</w:t>
-      </w:r>
-    </w:p>
-    <w:p>
-      <w:pPr>
-        <w:widowControl w:val="0"/>
-        <w:autoSpaceDE w:val="0"/>
-        <w:autoSpaceDN w:val="0"/>
-        <w:adjustRightInd w:val="0"/>
-        <w:spacing w:before="160" w:line="240" w:lineRule="auto"/>
-        <w:ind w:left="360" w:right="360"/>
-        <w:rPr>
-          <w:rFonts w:ascii="Calibri" w:hAnsi="Calibri" w:cs="Calibri"/>
-          <w:b/>
-          <w:bCs/>
-          <w:color w:val="C85028"/>
-          <w:kern w:val="0"/>
-        </w:rPr>
       </w:pPr>
     </w:p>
     <w:p>
@@ -5591,73 +5633,58 @@
         <w:ind w:left="360" w:right="360"/>
         <w:rPr>
           <w:rFonts w:ascii="Calibri" w:hAnsi="Calibri" w:cs="Calibri"/>
+          <w:color w:val="000000"/>
+          <w:kern w:val="0"/>
+          <w:sz w:val="22"/>
+          <w:szCs w:val="22"/>
+        </w:rPr>
+      </w:pPr>
+      <w:r>
+        <w:rPr>
+          <w:rFonts w:ascii="Calibri" w:hAnsi="Calibri" w:cs="Calibri"/>
           <w:b/>
           <w:bCs/>
+          <w:noProof/>
           <w:color w:val="C85028"/>
           <w:kern w:val="0"/>
         </w:rPr>
-      </w:pPr>
-      <w:r>
-        <w:rPr>
-          <w:rFonts w:ascii="Calibri" w:hAnsi="Calibri" w:cs="Calibri"/>
-          <w:b/>
-          <w:bCs/>
-          <w:color w:val="C85028"/>
-          <w:kern w:val="0"/>
-        </w:rPr>
-        <w:t xml:space="preserve">[PLACEHOLDER DIAGRAMME 3 : Vue collaborative - insérer ici l'export PNG ou PDF du fichier </w:t>
-      </w:r>
-      <w:proofErr w:type="spellStart"/>
-      <w:r>
-        <w:rPr>
-          <w:rFonts w:ascii="Calibri" w:hAnsi="Calibri" w:cs="Calibri"/>
-          <w:b/>
-          <w:bCs/>
-          <w:color w:val="C85028"/>
-          <w:kern w:val="0"/>
-        </w:rPr>
-        <w:t>collaboration_</w:t>
-      </w:r>
-      <w:proofErr w:type="gramStart"/>
-      <w:r>
-        <w:rPr>
-          <w:rFonts w:ascii="Calibri" w:hAnsi="Calibri" w:cs="Calibri"/>
-          <w:b/>
-          <w:bCs/>
-          <w:color w:val="C85028"/>
-          <w:kern w:val="0"/>
-        </w:rPr>
-        <w:t>overview.drawio</w:t>
-      </w:r>
-      <w:proofErr w:type="spellEnd"/>
-      <w:proofErr w:type="gramEnd"/>
-      <w:r>
-        <w:rPr>
-          <w:rFonts w:ascii="Calibri" w:hAnsi="Calibri" w:cs="Calibri"/>
-          <w:b/>
-          <w:bCs/>
-          <w:color w:val="C85028"/>
-          <w:kern w:val="0"/>
-        </w:rPr>
-        <w:t>.]</w:t>
-      </w:r>
-    </w:p>
-    <w:p>
-      <w:pPr>
-        <w:widowControl w:val="0"/>
-        <w:autoSpaceDE w:val="0"/>
-        <w:autoSpaceDN w:val="0"/>
-        <w:adjustRightInd w:val="0"/>
-        <w:spacing w:before="160" w:line="240" w:lineRule="auto"/>
-        <w:ind w:left="360" w:right="360"/>
-        <w:rPr>
-          <w:rFonts w:ascii="Calibri" w:hAnsi="Calibri" w:cs="Calibri"/>
-          <w:color w:val="000000"/>
-          <w:kern w:val="0"/>
-          <w:sz w:val="22"/>
-          <w:szCs w:val="22"/>
-        </w:rPr>
-      </w:pPr>
+        <w:lastRenderedPageBreak/>
+        <w:drawing>
+          <wp:inline distT="0" distB="0" distL="0" distR="0" wp14:anchorId="05F8DADE" wp14:editId="33655C15">
+            <wp:extent cx="6120130" cy="3797935"/>
+            <wp:effectExtent l="0" t="0" r="0" b="0"/>
+            <wp:docPr id="546086273" name="Picture 1"/>
+            <wp:cNvGraphicFramePr>
+              <a:graphicFrameLocks xmlns:a="http://schemas.openxmlformats.org/drawingml/2006/main" noChangeAspect="1"/>
+            </wp:cNvGraphicFramePr>
+            <a:graphic xmlns:a="http://schemas.openxmlformats.org/drawingml/2006/main">
+              <a:graphicData uri="http://schemas.openxmlformats.org/drawingml/2006/picture">
+                <pic:pic xmlns:pic="http://schemas.openxmlformats.org/drawingml/2006/picture">
+                  <pic:nvPicPr>
+                    <pic:cNvPr id="546086273" name=""/>
+                    <pic:cNvPicPr/>
+                  </pic:nvPicPr>
+                  <pic:blipFill>
+                    <a:blip r:embed="rId5"/>
+                    <a:stretch>
+                      <a:fillRect/>
+                    </a:stretch>
+                  </pic:blipFill>
+                  <pic:spPr>
+                    <a:xfrm>
+                      <a:off x="0" y="0"/>
+                      <a:ext cx="6120130" cy="3797935"/>
+                    </a:xfrm>
+                    <a:prstGeom prst="rect">
+                      <a:avLst/>
+                    </a:prstGeom>
+                  </pic:spPr>
+                </pic:pic>
+              </a:graphicData>
+            </a:graphic>
+          </wp:inline>
+        </w:drawing>
+      </w:r>
     </w:p>
     <w:p>
       <w:pPr>
@@ -5897,18 +5924,7 @@
           <w:sz w:val="22"/>
           <w:szCs w:val="22"/>
         </w:rPr>
-        <w:t xml:space="preserve"> : un score n'a de valeur que comparé à un référentiel </w:t>
-      </w:r>
-      <w:r>
-        <w:rPr>
-          <w:rFonts w:ascii="Calibri" w:hAnsi="Calibri" w:cs="Calibri"/>
-          <w:color w:val="000000"/>
-          <w:kern w:val="0"/>
-          <w:sz w:val="22"/>
-          <w:szCs w:val="22"/>
-        </w:rPr>
-        <w:lastRenderedPageBreak/>
-        <w:t>partagé.</w:t>
+        <w:t xml:space="preserve"> : un score n'a de valeur que comparé à un référentiel partagé.</w:t>
       </w:r>
     </w:p>
     <w:p>
@@ -6033,35 +6049,6 @@
     </w:p>
     <w:p>
       <w:pPr>
-        <w:keepNext/>
-        <w:widowControl w:val="0"/>
-        <w:autoSpaceDE w:val="0"/>
-        <w:autoSpaceDN w:val="0"/>
-        <w:adjustRightInd w:val="0"/>
-        <w:spacing w:before="240" w:after="120" w:line="240" w:lineRule="auto"/>
-        <w:rPr>
-          <w:rFonts w:ascii="Calibri" w:hAnsi="Calibri" w:cs="Calibri"/>
-          <w:color w:val="000000"/>
-          <w:kern w:val="0"/>
-          <w:sz w:val="22"/>
-          <w:szCs w:val="22"/>
-        </w:rPr>
-      </w:pPr>
-      <w:r>
-        <w:rPr>
-          <w:rFonts w:ascii="Calibri" w:hAnsi="Calibri" w:cs="Calibri"/>
-          <w:b/>
-          <w:bCs/>
-          <w:color w:val="00468C"/>
-          <w:kern w:val="0"/>
-          <w:sz w:val="40"/>
-          <w:szCs w:val="40"/>
-        </w:rPr>
-        <w:t>9. Annexes - schémas associés</w:t>
-      </w:r>
-    </w:p>
-    <w:p>
-      <w:pPr>
         <w:widowControl w:val="0"/>
         <w:autoSpaceDE w:val="0"/>
         <w:autoSpaceDN w:val="0"/>
@@ -6075,403 +6062,6 @@
           <w:szCs w:val="22"/>
         </w:rPr>
       </w:pPr>
-      <w:r>
-        <w:rPr>
-          <w:rFonts w:ascii="Calibri" w:hAnsi="Calibri" w:cs="Calibri"/>
-          <w:color w:val="000000"/>
-          <w:kern w:val="0"/>
-          <w:sz w:val="22"/>
-          <w:szCs w:val="22"/>
-        </w:rPr>
-        <w:t xml:space="preserve">Trois diagrammes </w:t>
-      </w:r>
-      <w:proofErr w:type="spellStart"/>
-      <w:r>
-        <w:rPr>
-          <w:rFonts w:ascii="Calibri" w:hAnsi="Calibri" w:cs="Calibri"/>
-          <w:color w:val="000000"/>
-          <w:kern w:val="0"/>
-          <w:sz w:val="22"/>
-          <w:szCs w:val="22"/>
-        </w:rPr>
-        <w:t>drawio</w:t>
-      </w:r>
-      <w:proofErr w:type="spellEnd"/>
-      <w:r>
-        <w:rPr>
-          <w:rFonts w:ascii="Calibri" w:hAnsi="Calibri" w:cs="Calibri"/>
-          <w:color w:val="000000"/>
-          <w:kern w:val="0"/>
-          <w:sz w:val="22"/>
-          <w:szCs w:val="22"/>
-        </w:rPr>
-        <w:t xml:space="preserve"> sont fournis dans ce répertoire et sont à insérer aux emplacements signalés par les blocs PLACEHOLDER ci-dessus :</w:t>
-      </w:r>
-    </w:p>
-    <w:p>
-      <w:pPr>
-        <w:widowControl w:val="0"/>
-        <w:autoSpaceDE w:val="0"/>
-        <w:autoSpaceDN w:val="0"/>
-        <w:adjustRightInd w:val="0"/>
-        <w:spacing w:after="80" w:line="276" w:lineRule="auto"/>
-        <w:ind w:left="720" w:hanging="360"/>
-        <w:rPr>
-          <w:rFonts w:ascii="Calibri" w:hAnsi="Calibri" w:cs="Calibri"/>
-          <w:color w:val="000000"/>
-          <w:kern w:val="0"/>
-          <w:sz w:val="22"/>
-          <w:szCs w:val="22"/>
-          <w:lang w:val="en-US"/>
-        </w:rPr>
-      </w:pPr>
-      <w:r>
-        <w:rPr>
-          <w:rFonts w:ascii="Calibri" w:hAnsi="Calibri" w:cs="Calibri"/>
-          <w:color w:val="000000"/>
-          <w:kern w:val="0"/>
-          <w:sz w:val="22"/>
-          <w:szCs w:val="22"/>
-          <w:lang w:val="en-US"/>
-        </w:rPr>
-        <w:t>•</w:t>
-      </w:r>
-      <w:r>
-        <w:rPr>
-          <w:rFonts w:ascii="Calibri" w:hAnsi="Calibri" w:cs="Calibri"/>
-          <w:color w:val="000000"/>
-          <w:kern w:val="0"/>
-          <w:sz w:val="22"/>
-          <w:szCs w:val="22"/>
-          <w:lang w:val="en-US"/>
-        </w:rPr>
-        <w:tab/>
-      </w:r>
-      <w:proofErr w:type="spellStart"/>
-      <w:r>
-        <w:rPr>
-          <w:rFonts w:ascii="Calibri" w:hAnsi="Calibri" w:cs="Calibri"/>
-          <w:color w:val="000000"/>
-          <w:kern w:val="0"/>
-          <w:sz w:val="22"/>
-          <w:szCs w:val="22"/>
-          <w:lang w:val="en-US"/>
-        </w:rPr>
-        <w:t>squad_</w:t>
-      </w:r>
-      <w:proofErr w:type="gramStart"/>
-      <w:r>
-        <w:rPr>
-          <w:rFonts w:ascii="Calibri" w:hAnsi="Calibri" w:cs="Calibri"/>
-          <w:color w:val="000000"/>
-          <w:kern w:val="0"/>
-          <w:sz w:val="22"/>
-          <w:szCs w:val="22"/>
-          <w:lang w:val="en-US"/>
-        </w:rPr>
-        <w:t>workflow.drawio</w:t>
-      </w:r>
-      <w:proofErr w:type="spellEnd"/>
-      <w:proofErr w:type="gramEnd"/>
-      <w:r>
-        <w:rPr>
-          <w:rFonts w:ascii="Calibri" w:hAnsi="Calibri" w:cs="Calibri"/>
-          <w:color w:val="000000"/>
-          <w:kern w:val="0"/>
-          <w:sz w:val="22"/>
-          <w:szCs w:val="22"/>
-          <w:lang w:val="en-US"/>
-        </w:rPr>
-        <w:t xml:space="preserve"> : workflow </w:t>
-      </w:r>
-      <w:proofErr w:type="spellStart"/>
-      <w:r>
-        <w:rPr>
-          <w:rFonts w:ascii="Calibri" w:hAnsi="Calibri" w:cs="Calibri"/>
-          <w:color w:val="000000"/>
-          <w:kern w:val="0"/>
-          <w:sz w:val="22"/>
-          <w:szCs w:val="22"/>
-          <w:lang w:val="en-US"/>
-        </w:rPr>
-        <w:t>d'une</w:t>
-      </w:r>
-      <w:proofErr w:type="spellEnd"/>
-      <w:r>
-        <w:rPr>
-          <w:rFonts w:ascii="Calibri" w:hAnsi="Calibri" w:cs="Calibri"/>
-          <w:color w:val="000000"/>
-          <w:kern w:val="0"/>
-          <w:sz w:val="22"/>
-          <w:szCs w:val="22"/>
-          <w:lang w:val="en-US"/>
-        </w:rPr>
-        <w:t xml:space="preserve"> Squad sur un sprint.</w:t>
-      </w:r>
-    </w:p>
-    <w:p>
-      <w:pPr>
-        <w:widowControl w:val="0"/>
-        <w:autoSpaceDE w:val="0"/>
-        <w:autoSpaceDN w:val="0"/>
-        <w:adjustRightInd w:val="0"/>
-        <w:spacing w:after="80" w:line="276" w:lineRule="auto"/>
-        <w:ind w:left="720" w:hanging="360"/>
-        <w:rPr>
-          <w:rFonts w:ascii="Calibri" w:hAnsi="Calibri" w:cs="Calibri"/>
-          <w:color w:val="000000"/>
-          <w:kern w:val="0"/>
-          <w:sz w:val="22"/>
-          <w:szCs w:val="22"/>
-          <w:lang w:val="en-US"/>
-        </w:rPr>
-      </w:pPr>
-      <w:r>
-        <w:rPr>
-          <w:rFonts w:ascii="Calibri" w:hAnsi="Calibri" w:cs="Calibri"/>
-          <w:color w:val="000000"/>
-          <w:kern w:val="0"/>
-          <w:sz w:val="22"/>
-          <w:szCs w:val="22"/>
-          <w:lang w:val="en-US"/>
-        </w:rPr>
-        <w:t>•</w:t>
-      </w:r>
-      <w:r>
-        <w:rPr>
-          <w:rFonts w:ascii="Calibri" w:hAnsi="Calibri" w:cs="Calibri"/>
-          <w:color w:val="000000"/>
-          <w:kern w:val="0"/>
-          <w:sz w:val="22"/>
-          <w:szCs w:val="22"/>
-          <w:lang w:val="en-US"/>
-        </w:rPr>
-        <w:tab/>
-      </w:r>
-      <w:proofErr w:type="spellStart"/>
-      <w:r>
-        <w:rPr>
-          <w:rFonts w:ascii="Calibri" w:hAnsi="Calibri" w:cs="Calibri"/>
-          <w:color w:val="000000"/>
-          <w:kern w:val="0"/>
-          <w:sz w:val="22"/>
-          <w:szCs w:val="22"/>
-          <w:lang w:val="en-US"/>
-        </w:rPr>
-        <w:t>design_review_</w:t>
-      </w:r>
-      <w:proofErr w:type="gramStart"/>
-      <w:r>
-        <w:rPr>
-          <w:rFonts w:ascii="Calibri" w:hAnsi="Calibri" w:cs="Calibri"/>
-          <w:color w:val="000000"/>
-          <w:kern w:val="0"/>
-          <w:sz w:val="22"/>
-          <w:szCs w:val="22"/>
-          <w:lang w:val="en-US"/>
-        </w:rPr>
-        <w:t>workflow.drawio</w:t>
-      </w:r>
-      <w:proofErr w:type="spellEnd"/>
-      <w:proofErr w:type="gramEnd"/>
-      <w:r>
-        <w:rPr>
-          <w:rFonts w:ascii="Calibri" w:hAnsi="Calibri" w:cs="Calibri"/>
-          <w:color w:val="000000"/>
-          <w:kern w:val="0"/>
-          <w:sz w:val="22"/>
-          <w:szCs w:val="22"/>
-          <w:lang w:val="en-US"/>
-        </w:rPr>
-        <w:t xml:space="preserve"> : </w:t>
-      </w:r>
-      <w:proofErr w:type="spellStart"/>
-      <w:r>
-        <w:rPr>
-          <w:rFonts w:ascii="Calibri" w:hAnsi="Calibri" w:cs="Calibri"/>
-          <w:color w:val="000000"/>
-          <w:kern w:val="0"/>
-          <w:sz w:val="22"/>
-          <w:szCs w:val="22"/>
-          <w:lang w:val="en-US"/>
-        </w:rPr>
-        <w:t>déroulé</w:t>
-      </w:r>
-      <w:proofErr w:type="spellEnd"/>
-      <w:r>
-        <w:rPr>
-          <w:rFonts w:ascii="Calibri" w:hAnsi="Calibri" w:cs="Calibri"/>
-          <w:color w:val="000000"/>
-          <w:kern w:val="0"/>
-          <w:sz w:val="22"/>
-          <w:szCs w:val="22"/>
-          <w:lang w:val="en-US"/>
-        </w:rPr>
-        <w:t xml:space="preserve"> d'un Design Review.</w:t>
-      </w:r>
-    </w:p>
-    <w:p>
-      <w:pPr>
-        <w:widowControl w:val="0"/>
-        <w:autoSpaceDE w:val="0"/>
-        <w:autoSpaceDN w:val="0"/>
-        <w:adjustRightInd w:val="0"/>
-        <w:spacing w:after="80" w:line="276" w:lineRule="auto"/>
-        <w:ind w:left="720" w:hanging="360"/>
-        <w:rPr>
-          <w:rFonts w:ascii="Calibri" w:hAnsi="Calibri" w:cs="Calibri"/>
-          <w:color w:val="000000"/>
-          <w:kern w:val="0"/>
-          <w:sz w:val="22"/>
-          <w:szCs w:val="22"/>
-        </w:rPr>
-      </w:pPr>
-      <w:r>
-        <w:rPr>
-          <w:rFonts w:ascii="Calibri" w:hAnsi="Calibri" w:cs="Calibri"/>
-          <w:color w:val="000000"/>
-          <w:kern w:val="0"/>
-          <w:sz w:val="22"/>
-          <w:szCs w:val="22"/>
-        </w:rPr>
-        <w:t>•</w:t>
-      </w:r>
-      <w:r>
-        <w:rPr>
-          <w:rFonts w:ascii="Calibri" w:hAnsi="Calibri" w:cs="Calibri"/>
-          <w:color w:val="000000"/>
-          <w:kern w:val="0"/>
-          <w:sz w:val="22"/>
-          <w:szCs w:val="22"/>
-        </w:rPr>
-        <w:tab/>
-      </w:r>
-      <w:proofErr w:type="spellStart"/>
-      <w:r>
-        <w:rPr>
-          <w:rFonts w:ascii="Calibri" w:hAnsi="Calibri" w:cs="Calibri"/>
-          <w:color w:val="000000"/>
-          <w:kern w:val="0"/>
-          <w:sz w:val="22"/>
-          <w:szCs w:val="22"/>
-        </w:rPr>
-        <w:t>collaboration_</w:t>
-      </w:r>
-      <w:proofErr w:type="gramStart"/>
-      <w:r>
-        <w:rPr>
-          <w:rFonts w:ascii="Calibri" w:hAnsi="Calibri" w:cs="Calibri"/>
-          <w:color w:val="000000"/>
-          <w:kern w:val="0"/>
-          <w:sz w:val="22"/>
-          <w:szCs w:val="22"/>
-        </w:rPr>
-        <w:t>overview.drawio</w:t>
-      </w:r>
-      <w:proofErr w:type="spellEnd"/>
-      <w:proofErr w:type="gramEnd"/>
-      <w:r>
-        <w:rPr>
-          <w:rFonts w:ascii="Calibri" w:hAnsi="Calibri" w:cs="Calibri"/>
-          <w:color w:val="000000"/>
-          <w:kern w:val="0"/>
-          <w:sz w:val="22"/>
-          <w:szCs w:val="22"/>
-        </w:rPr>
-        <w:t xml:space="preserve"> : vue d'ensemble de la collaboration entre </w:t>
-      </w:r>
-      <w:proofErr w:type="spellStart"/>
-      <w:r>
-        <w:rPr>
-          <w:rFonts w:ascii="Calibri" w:hAnsi="Calibri" w:cs="Calibri"/>
-          <w:color w:val="000000"/>
-          <w:kern w:val="0"/>
-          <w:sz w:val="22"/>
-          <w:szCs w:val="22"/>
-        </w:rPr>
-        <w:t>Squads</w:t>
-      </w:r>
-      <w:proofErr w:type="spellEnd"/>
-      <w:r>
-        <w:rPr>
-          <w:rFonts w:ascii="Calibri" w:hAnsi="Calibri" w:cs="Calibri"/>
-          <w:color w:val="000000"/>
-          <w:kern w:val="0"/>
-          <w:sz w:val="22"/>
-          <w:szCs w:val="22"/>
-        </w:rPr>
-        <w:t xml:space="preserve">, Tech Leads et Design </w:t>
-      </w:r>
-      <w:proofErr w:type="spellStart"/>
-      <w:r>
-        <w:rPr>
-          <w:rFonts w:ascii="Calibri" w:hAnsi="Calibri" w:cs="Calibri"/>
-          <w:color w:val="000000"/>
-          <w:kern w:val="0"/>
-          <w:sz w:val="22"/>
-          <w:szCs w:val="22"/>
-        </w:rPr>
-        <w:t>Review</w:t>
-      </w:r>
-      <w:proofErr w:type="spellEnd"/>
-      <w:r>
-        <w:rPr>
-          <w:rFonts w:ascii="Calibri" w:hAnsi="Calibri" w:cs="Calibri"/>
-          <w:color w:val="000000"/>
-          <w:kern w:val="0"/>
-          <w:sz w:val="22"/>
-          <w:szCs w:val="22"/>
-        </w:rPr>
-        <w:t>.</w:t>
-      </w:r>
-    </w:p>
-    <w:p>
-      <w:pPr>
-        <w:widowControl w:val="0"/>
-        <w:autoSpaceDE w:val="0"/>
-        <w:autoSpaceDN w:val="0"/>
-        <w:adjustRightInd w:val="0"/>
-        <w:spacing w:after="120" w:line="276" w:lineRule="auto"/>
-        <w:rPr>
-          <w:rFonts w:ascii="Calibri" w:hAnsi="Calibri" w:cs="Calibri"/>
-          <w:color w:val="000000"/>
-          <w:kern w:val="0"/>
-          <w:sz w:val="22"/>
-          <w:szCs w:val="22"/>
-        </w:rPr>
-      </w:pPr>
-      <w:r>
-        <w:rPr>
-          <w:rFonts w:ascii="Calibri" w:hAnsi="Calibri" w:cs="Calibri"/>
-          <w:color w:val="000000"/>
-          <w:kern w:val="0"/>
-          <w:sz w:val="22"/>
-          <w:szCs w:val="22"/>
-        </w:rPr>
-        <w:t xml:space="preserve">Pour les ouvrir : utilisez https://app.diagrams.net ou l'extension Visual Studio Code Draw.io </w:t>
-      </w:r>
-      <w:proofErr w:type="spellStart"/>
-      <w:r>
-        <w:rPr>
-          <w:rFonts w:ascii="Calibri" w:hAnsi="Calibri" w:cs="Calibri"/>
-          <w:color w:val="000000"/>
-          <w:kern w:val="0"/>
-          <w:sz w:val="22"/>
-          <w:szCs w:val="22"/>
-        </w:rPr>
-        <w:t>Integration</w:t>
-      </w:r>
-      <w:proofErr w:type="spellEnd"/>
-      <w:r>
-        <w:rPr>
-          <w:rFonts w:ascii="Calibri" w:hAnsi="Calibri" w:cs="Calibri"/>
-          <w:color w:val="000000"/>
-          <w:kern w:val="0"/>
-          <w:sz w:val="22"/>
-          <w:szCs w:val="22"/>
-        </w:rPr>
-        <w:t>. Exportez ensuite en PNG ou PDF puis remplacez les blocs PLACEHOLDER de ce document par l'image correspondante.</w:t>
-      </w:r>
     </w:p>
     <w:sectPr>
       <w:pgSz w:w="11906" w:h="16838"/>

</xml_diff>